<commit_message>
:bug: added a clarifier however
</commit_message>
<xml_diff>
--- a/Lectures/Lecture16_Mar19/The Problem Outline In Class Soln.docx
+++ b/Lectures/Lecture16_Mar19/The Problem Outline In Class Soln.docx
@@ -97,7 +97,21 @@
           <w:sz w:val="24"/>
           <w:szCs w:val="24"/>
         </w:rPr>
-        <w:t xml:space="preserve">on their host or on other orbiting objects. This assumption breaks down if the total mass of the satellite is a significant fraction of the host’s mass – this is true of the Magellanic Clouds. </w:t>
+        <w:t xml:space="preserve">on their host or on other orbiting objects. </w:t>
+      </w:r>
+      <w:r>
+        <w:rPr>
+          <w:sz w:val="24"/>
+          <w:szCs w:val="24"/>
+        </w:rPr>
+        <w:t>However, this</w:t>
+      </w:r>
+      <w:r>
+        <w:rPr>
+          <w:sz w:val="24"/>
+          <w:szCs w:val="24"/>
+        </w:rPr>
+        <w:t xml:space="preserve"> assumption breaks down if the total mass of the satellite is a significant fraction of the host’s mass – this is true of the Magellanic Clouds. </w:t>
       </w:r>
       <w:r>
         <w:rPr>
@@ -199,25 +213,7 @@
           <w:sz w:val="24"/>
           <w:szCs w:val="24"/>
         </w:rPr>
-        <w:t xml:space="preserve">UANCED </w:t>
-      </w:r>
-      <w:proofErr w:type="gramStart"/>
-      <w:r>
-        <w:rPr>
-          <w:color w:val="EE0000"/>
-          <w:sz w:val="24"/>
-          <w:szCs w:val="24"/>
-        </w:rPr>
-        <w:t>CONCLUSION :</w:t>
-      </w:r>
-      <w:proofErr w:type="gramEnd"/>
-      <w:r>
-        <w:rPr>
-          <w:color w:val="EE0000"/>
-          <w:sz w:val="24"/>
-          <w:szCs w:val="24"/>
-        </w:rPr>
-        <w:t xml:space="preserve">  N</w:t>
+        <w:t>UANCED CONCLUSION :  N</w:t>
       </w:r>
       <w:r>
         <w:rPr>
@@ -266,23 +262,13 @@
           <w:szCs w:val="24"/>
         </w:rPr>
       </w:pPr>
-      <w:proofErr w:type="gramStart"/>
-      <w:r>
-        <w:rPr>
-          <w:color w:val="EE0000"/>
-          <w:sz w:val="24"/>
-          <w:szCs w:val="24"/>
-        </w:rPr>
-        <w:t>CONCLUSON :</w:t>
-      </w:r>
-      <w:proofErr w:type="gramEnd"/>
-      <w:r>
-        <w:rPr>
-          <w:color w:val="EE0000"/>
-          <w:sz w:val="24"/>
-          <w:szCs w:val="24"/>
-        </w:rPr>
-        <w:t xml:space="preserve">  </w:t>
+      <w:r>
+        <w:rPr>
+          <w:color w:val="EE0000"/>
+          <w:sz w:val="24"/>
+          <w:szCs w:val="24"/>
+        </w:rPr>
+        <w:t xml:space="preserve">CONCLUSON :  </w:t>
       </w:r>
       <w:r>
         <w:rPr>
@@ -512,25 +498,7 @@
           <w:bCs/>
           <w:color w:val="EE0000"/>
         </w:rPr>
-        <w:t xml:space="preserve">The Magellanic Clouds </w:t>
-      </w:r>
-      <w:proofErr w:type="gramStart"/>
-      <w:r>
-        <w:rPr>
-          <w:b/>
-          <w:bCs/>
-          <w:color w:val="EE0000"/>
-        </w:rPr>
-        <w:t>will</w:t>
-      </w:r>
-      <w:proofErr w:type="gramEnd"/>
-      <w:r>
-        <w:rPr>
-          <w:b/>
-          <w:bCs/>
-          <w:color w:val="EE0000"/>
-        </w:rPr>
-        <w:t xml:space="preserve"> Perturb the Orbits of all Halo Tracers</w:t>
+        <w:t>The Magellanic Clouds will Perturb the Orbits of all Halo Tracers</w:t>
       </w:r>
     </w:p>
     <w:p>
@@ -581,25 +549,7 @@
           <w:b/>
           <w:bCs/>
         </w:rPr>
-        <w:t xml:space="preserve">[ Usually this involves some sort of assumption or method that is </w:t>
-      </w:r>
-      <w:proofErr w:type="gramStart"/>
-      <w:r>
-        <w:rPr>
-          <w:rFonts w:asciiTheme="majorHAnsi" w:hAnsiTheme="majorHAnsi" w:cstheme="majorHAnsi"/>
-          <w:b/>
-          <w:bCs/>
-        </w:rPr>
-        <w:t>outdated ]</w:t>
-      </w:r>
-      <w:proofErr w:type="gramEnd"/>
-      <w:r>
-        <w:rPr>
-          <w:rFonts w:asciiTheme="majorHAnsi" w:hAnsiTheme="majorHAnsi" w:cstheme="majorHAnsi"/>
-          <w:b/>
-          <w:bCs/>
-        </w:rPr>
-        <w:t xml:space="preserve"> </w:t>
+        <w:t xml:space="preserve">[ Usually this involves some sort of assumption or method that is outdated ] </w:t>
       </w:r>
     </w:p>
     <w:p>

</xml_diff>